<commit_message>
Retrofit Di Molfetta example to v1.1 auditable format
Add provenance header (source files, supplement Y/N, method version v1.1),
AI-use disclosure, and a human sign-off block to both the .md and .docx.
Marked "pending sign-off" to model that an AI draft is not authoritative
until a named person verifies it.

Co-Authored-By: Claude Opus 4.8 <noreply@anthropic.com>
</commit_message>
<xml_diff>
--- a/examples/Di-Molfetta-2024-NMA/Di_Molfetta_2024_NMA_appraisal.docx
+++ b/examples/Di-Molfetta-2024-NMA/Di_Molfetta_2024_NMA_appraisal.docx
@@ -83,6 +83,27 @@
           <w:sz w:val="18"/>
           <w:szCs w:val="18"/>
         </w:rPr>
+        <w:t xml:space="preserve">Source files:  </w:t>
+      </w:r>
+      <w:r>
+        <w:rPr>
+          <w:sz w:val="18"/>
+          <w:szCs w:val="18"/>
+        </w:rPr>
+        <w:t xml:space="preserve">peer-reviewed article PDF + Supporting Information S1 (dmrr3842-sup-0001-suppl-data.docx)   •   Supplement included: Yes (SI S1, reviewed in full)</w:t>
+      </w:r>
+    </w:p>
+    <w:p>
+      <w:pPr>
+        <w:spacing w:after="40"/>
+      </w:pPr>
+      <w:r>
+        <w:rPr>
+          <w:b/>
+          <w:bCs/>
+          <w:sz w:val="18"/>
+          <w:szCs w:val="18"/>
+        </w:rPr>
         <w:t xml:space="preserve">Appraisal date:  </w:t>
       </w:r>
       <w:r>
@@ -90,7 +111,7 @@
           <w:sz w:val="18"/>
           <w:szCs w:val="18"/>
         </w:rPr>
-        <w:t xml:space="preserve">10 July 2026</w:t>
+        <w:t xml:space="preserve">10 July 2026   •   Method version: evidence-appraisal v1.1</w:t>
       </w:r>
     </w:p>
     <w:p>
@@ -111,7 +132,28 @@
           <w:sz w:val="18"/>
           <w:szCs w:val="18"/>
         </w:rPr>
-        <w:t xml:space="preserve">PRISMA 2020 (+ PRISMA-NMA items); ROBIS; AMSTAR-2.</w:t>
+        <w:t xml:space="preserve">PRISMA 2020 (+ PRISMA-NMA, Hutton 2015); ROBIS (Whiting 2016); AMSTAR-2 (Shea 2017).</w:t>
+      </w:r>
+    </w:p>
+    <w:p>
+      <w:pPr>
+        <w:spacing w:after="40"/>
+      </w:pPr>
+      <w:r>
+        <w:rPr>
+          <w:b/>
+          <w:bCs/>
+          <w:sz w:val="18"/>
+          <w:szCs w:val="18"/>
+        </w:rPr>
+        <w:t xml:space="preserve">Prepared by:  </w:t>
+      </w:r>
+      <w:r>
+        <w:rPr>
+          <w:sz w:val="18"/>
+          <w:szCs w:val="18"/>
+        </w:rPr>
+        <w:t xml:space="preserve">AI-assisted draft (Claude)   •   Verified by: ____________ (name, role, date) — pending sign-off</w:t>
       </w:r>
     </w:p>
     <w:p>
@@ -8252,6 +8294,96 @@
     </w:p>
     <w:p>
       <w:pPr>
+        <w:pStyle w:val="Heading1"/>
+      </w:pPr>
+      <w:r>
+        <w:t xml:space="preserve">7.  Provenance &amp; sign-off</w:t>
+      </w:r>
+    </w:p>
+    <w:p>
+      <w:pPr>
+        <w:spacing w:after="120"/>
+      </w:pPr>
+      <w:r>
+        <w:rPr>
+          <w:b/>
+          <w:bCs/>
+        </w:rPr>
+        <w:t xml:space="preserve">Method: </w:t>
+      </w:r>
+      <w:r>
+        <w:t xml:space="preserve">evidence-appraisal v1.1; PRISMA 2020, PRISMA-NMA (Hutton 2015), ROBIS (Whiting 2016), AMSTAR-2 (Shea 2017).</w:t>
+      </w:r>
+    </w:p>
+    <w:p>
+      <w:pPr>
+        <w:spacing w:after="120"/>
+      </w:pPr>
+      <w:r>
+        <w:rPr>
+          <w:b/>
+          <w:bCs/>
+        </w:rPr>
+        <w:t xml:space="preserve">Inputs seen: </w:t>
+      </w:r>
+      <w:r>
+        <w:t xml:space="preserve">the published article and Supporting Information S1 (dmrr3842-sup-0001-suppl-data.docx). No items remain “not verified” — the supplement was reviewed in full.</w:t>
+      </w:r>
+    </w:p>
+    <w:p>
+      <w:pPr>
+        <w:spacing w:after="120"/>
+      </w:pPr>
+      <w:r>
+        <w:rPr>
+          <w:b/>
+          <w:bCs/>
+        </w:rPr>
+        <w:t xml:space="preserve">AI disclosure: </w:t>
+      </w:r>
+      <w:r>
+        <w:t xml:space="preserve">produced as an AI-assisted draft (Claude). Not authoritative until verified below.</w:t>
+      </w:r>
+    </w:p>
+    <w:p>
+      <w:pPr>
+        <w:spacing w:after="120"/>
+      </w:pPr>
+      <w:r>
+        <w:rPr>
+          <w:b/>
+          <w:bCs/>
+          <w:color w:val="1F4E5F"/>
+        </w:rPr>
+        <w:t xml:space="preserve">Verification — required before use in a dossier or submission:</w:t>
+      </w:r>
+    </w:p>
+    <w:p>
+      <w:pPr>
+        <w:spacing w:after="140"/>
+      </w:pPr>
+      <w:r>
+        <w:rPr>
+          <w:sz w:val="20"/>
+          <w:szCs w:val="20"/>
+        </w:rPr>
+        <w:t xml:space="preserve">Verified by: ____________________      Role: ______________      Date: __________</w:t>
+      </w:r>
+    </w:p>
+    <w:p>
+      <w:pPr>
+        <w:spacing w:after="60"/>
+      </w:pPr>
+      <w:r>
+        <w:rPr>
+          <w:sz w:val="20"/>
+          <w:szCs w:val="20"/>
+        </w:rPr>
+        <w:t xml:space="preserve">Verifier’s note (items checked, changed, or disputed): ______________________________</w:t>
+      </w:r>
+    </w:p>
+    <w:p>
+      <w:pPr>
         <w:spacing w:after="120"/>
       </w:pPr>
     </w:p>
@@ -8270,7 +8402,7 @@
           <w:sz w:val="16"/>
           <w:szCs w:val="16"/>
         </w:rPr>
-        <w:t xml:space="preserve">Finalised 10 July 2026 with Supporting Information S1 reviewed. AMSTAR-2 items 4 (Partial Yes) and 7 (No) confirmed; overall AMSTAR-2 = Low, ROBIS = Low risk of bias, PRISMA 2020 = high completeness.</w:t>
+        <w:t xml:space="preserve">Finalised 10 July 2026 with Supporting Information S1 reviewed. AMSTAR-2 items 4 (Partial Yes) and 7 (No) confirmed; overall AMSTAR-2 = Low, ROBIS = Low risk of bias, PRISMA 2020 = high completeness. Appraised under evidence-appraisal v1.1 — AI-assisted draft, pending human sign-off.</w:t>
       </w:r>
     </w:p>
     <w:sectPr>

</xml_diff>